<commit_message>
Thêm quy tắc nghiệp vụ cho Tài Khoản, QLCT/TN, Quản lý danh mục chi tiêu
</commit_message>
<xml_diff>
--- a/Document/Ghi Chú Về Giai Đoạn.docx
+++ b/Document/Ghi Chú Về Giai Đoạn.docx
@@ -611,7 +611,14 @@
         <w:t xml:space="preserve"> (làm sau khi có điều kiện)</w:t>
       </w:r>
     </w:p>
-    <w:p/>
+    <w:p>
+      <w:r>
+        <w:t>Local first -&gt; Manual Sync -&gt; Version-based conflict detect</w:t>
+      </w:r>
+      <w:r>
+        <w:t xml:space="preserve"> -&gt; LWW resolve</w:t>
+      </w:r>
+    </w:p>
     <w:p>
       <w:r>
         <w:t>Ước tính: ~ 8 tháng cho version 1.0 hoàn chỉnh</w:t>

</xml_diff>

<commit_message>
Hoàn thành quy tắc nghiệp vụ 1.0
</commit_message>
<xml_diff>
--- a/Document/Ghi Chú Về Giai Đoạn.docx
+++ b/Document/Ghi Chú Về Giai Đoạn.docx
@@ -617,6 +617,91 @@
       </w:r>
       <w:r>
         <w:t xml:space="preserve"> -&gt; LWW resolve</w:t>
+      </w:r>
+    </w:p>
+    <w:p/>
+    <w:p>
+      <w:r>
+        <w:t>Theo gợi ý, không nên làm bảng cho History ở version đầu mà thay vào đó là Union</w:t>
+      </w:r>
+    </w:p>
+    <w:p>
+      <w:r>
+        <w:drawing>
+          <wp:inline distT="0" distB="0" distL="0" distR="0" wp14:anchorId="643614B4" wp14:editId="628417B3">
+            <wp:extent cx="5943600" cy="5768340"/>
+            <wp:effectExtent l="0" t="0" r="0" b="3810"/>
+            <wp:docPr id="1281665759" name="Picture 1"/>
+            <wp:cNvGraphicFramePr>
+              <a:graphicFrameLocks xmlns:a="http://schemas.openxmlformats.org/drawingml/2006/main" noChangeAspect="1"/>
+            </wp:cNvGraphicFramePr>
+            <a:graphic xmlns:a="http://schemas.openxmlformats.org/drawingml/2006/main">
+              <a:graphicData uri="http://schemas.openxmlformats.org/drawingml/2006/picture">
+                <pic:pic xmlns:pic="http://schemas.openxmlformats.org/drawingml/2006/picture">
+                  <pic:nvPicPr>
+                    <pic:cNvPr id="1281665759" name=""/>
+                    <pic:cNvPicPr/>
+                  </pic:nvPicPr>
+                  <pic:blipFill>
+                    <a:blip r:embed="rId5"/>
+                    <a:stretch>
+                      <a:fillRect/>
+                    </a:stretch>
+                  </pic:blipFill>
+                  <pic:spPr>
+                    <a:xfrm>
+                      <a:off x="0" y="0"/>
+                      <a:ext cx="5943600" cy="5768340"/>
+                    </a:xfrm>
+                    <a:prstGeom prst="rect">
+                      <a:avLst/>
+                    </a:prstGeom>
+                  </pic:spPr>
+                </pic:pic>
+              </a:graphicData>
+            </a:graphic>
+          </wp:inline>
+        </w:drawing>
+      </w:r>
+    </w:p>
+    <w:p>
+      <w:r>
+        <w:lastRenderedPageBreak/>
+        <w:drawing>
+          <wp:inline distT="0" distB="0" distL="0" distR="0" wp14:anchorId="219B31F3" wp14:editId="70F8A5BC">
+            <wp:extent cx="5943600" cy="1922145"/>
+            <wp:effectExtent l="0" t="0" r="0" b="1905"/>
+            <wp:docPr id="2047844361" name="Picture 1"/>
+            <wp:cNvGraphicFramePr>
+              <a:graphicFrameLocks xmlns:a="http://schemas.openxmlformats.org/drawingml/2006/main" noChangeAspect="1"/>
+            </wp:cNvGraphicFramePr>
+            <a:graphic xmlns:a="http://schemas.openxmlformats.org/drawingml/2006/main">
+              <a:graphicData uri="http://schemas.openxmlformats.org/drawingml/2006/picture">
+                <pic:pic xmlns:pic="http://schemas.openxmlformats.org/drawingml/2006/picture">
+                  <pic:nvPicPr>
+                    <pic:cNvPr id="2047844361" name=""/>
+                    <pic:cNvPicPr/>
+                  </pic:nvPicPr>
+                  <pic:blipFill>
+                    <a:blip r:embed="rId6"/>
+                    <a:stretch>
+                      <a:fillRect/>
+                    </a:stretch>
+                  </pic:blipFill>
+                  <pic:spPr>
+                    <a:xfrm>
+                      <a:off x="0" y="0"/>
+                      <a:ext cx="5943600" cy="1922145"/>
+                    </a:xfrm>
+                    <a:prstGeom prst="rect">
+                      <a:avLst/>
+                    </a:prstGeom>
+                  </pic:spPr>
+                </pic:pic>
+              </a:graphicData>
+            </a:graphic>
+          </wp:inline>
+        </w:drawing>
       </w:r>
     </w:p>
     <w:p>

</xml_diff>